<commit_message>
Add report writing to Haiwen Yi contributions
</commit_message>
<xml_diff>
--- a/proposal/Proposal_Part1_EN.docx
+++ b/proposal/Proposal_Part1_EN.docx
@@ -243,7 +243,7 @@
                 <w:szCs w:val="19"/>
                 <w:rtl w:val="0"/>
               </w:rPr>
-              <w:t xml:space="preserve">Research design and statistical analysis.</w:t>
+              <w:t xml:space="preserve">Research design, statistical analysis, and report writing.</w:t>
             </w:r>
             <w:r>
               <w:rPr>
@@ -2795,12 +2795,12 @@
           <wp:inline distB="0" distT="0" distL="114300" distR="114300">
             <wp:extent cx="6492240" cy="2856586"/>
             <wp:effectExtent b="0" l="0" r="0" t="0"/>
-            <wp:docPr descr="Figure 1. Unadjusted price–area relationships by division." id="1" name="image1.png"/>
+            <wp:docPr descr="Figure 1. Unadjusted price–area relationships by division." id="1" name="image2.png"/>
             <a:graphic>
               <a:graphicData uri="http://schemas.openxmlformats.org/drawingml/2006/picture">
                 <pic:pic>
                   <pic:nvPicPr>
-                    <pic:cNvPr descr="Figure 1. Unadjusted price–area relationships by division." id="0" name="image1.png"/>
+                    <pic:cNvPr descr="Figure 1. Unadjusted price–area relationships by division." id="0" name="image2.png"/>
                     <pic:cNvPicPr preferRelativeResize="0"/>
                   </pic:nvPicPr>
                   <pic:blipFill>
@@ -5254,12 +5254,12 @@
           <wp:inline distB="0" distT="0" distL="114300" distR="114300">
             <wp:extent cx="6492240" cy="5356098"/>
             <wp:effectExtent b="0" l="0" r="0" t="0"/>
-            <wp:docPr descr="Figure 2. Observed–fitted relationship and predictor pairs." id="3" name="image2.png"/>
+            <wp:docPr descr="Figure 2. Observed–fitted relationship and predictor pairs." id="3" name="image3.png"/>
             <a:graphic>
               <a:graphicData uri="http://schemas.openxmlformats.org/drawingml/2006/picture">
                 <pic:pic>
                   <pic:nvPicPr>
-                    <pic:cNvPr descr="Figure 2. Observed–fitted relationship and predictor pairs." id="0" name="image2.png"/>
+                    <pic:cNvPr descr="Figure 2. Observed–fitted relationship and predictor pairs." id="0" name="image3.png"/>
                     <pic:cNvPicPr preferRelativeResize="0"/>
                   </pic:nvPicPr>
                   <pic:blipFill>
@@ -5359,12 +5359,12 @@
           <wp:inline distB="0" distT="0" distL="114300" distR="114300">
             <wp:extent cx="6492240" cy="4284878"/>
             <wp:effectExtent b="0" l="0" r="0" t="0"/>
-            <wp:docPr descr="Figure 3. Residuals, scale-location, Q–Q and numerical predictors." id="2" name="image4.png"/>
+            <wp:docPr descr="Figure 3. Residuals, scale-location, Q–Q and numerical predictors." id="2" name="image1.png"/>
             <a:graphic>
               <a:graphicData uri="http://schemas.openxmlformats.org/drawingml/2006/picture">
                 <pic:pic>
                   <pic:nvPicPr>
-                    <pic:cNvPr descr="Figure 3. Residuals, scale-location, Q–Q and numerical predictors." id="0" name="image4.png"/>
+                    <pic:cNvPr descr="Figure 3. Residuals, scale-location, Q–Q and numerical predictors." id="0" name="image1.png"/>
                     <pic:cNvPicPr preferRelativeResize="0"/>
                   </pic:nvPicPr>
                   <pic:blipFill>
@@ -5465,12 +5465,12 @@
           <wp:inline distB="0" distT="0" distL="114300" distR="114300">
             <wp:extent cx="5697415" cy="7406640"/>
             <wp:effectExtent b="0" l="0" r="0" t="0"/>
-            <wp:docPr descr="Figure 4. Categorical residuals and standardized-residual distribution." id="4" name="image3.png"/>
+            <wp:docPr descr="Figure 4. Categorical residuals and standardized-residual distribution." id="4" name="image4.png"/>
             <a:graphic>
               <a:graphicData uri="http://schemas.openxmlformats.org/drawingml/2006/picture">
                 <pic:pic>
                   <pic:nvPicPr>
-                    <pic:cNvPr descr="Figure 4. Categorical residuals and standardized-residual distribution." id="0" name="image3.png"/>
+                    <pic:cNvPr descr="Figure 4. Categorical residuals and standardized-residual distribution." id="0" name="image4.png"/>
                     <pic:cNvPicPr preferRelativeResize="0"/>
                   </pic:nvPicPr>
                   <pic:blipFill>

</xml_diff>

<commit_message>
Add shared material links and sync confirmed team assignments
</commit_message>
<xml_diff>
--- a/proposal/Proposal_Part1_EN.docx
+++ b/proposal/Proposal_Part1_EN.docx
@@ -2795,12 +2795,12 @@
           <wp:inline distB="0" distT="0" distL="114300" distR="114300">
             <wp:extent cx="6492240" cy="2856586"/>
             <wp:effectExtent b="0" l="0" r="0" t="0"/>
-            <wp:docPr descr="Figure 1. Unadjusted price–area relationships by division." id="1" name="image2.png"/>
+            <wp:docPr descr="Figure 1. Unadjusted price–area relationships by division." id="1" name="image1.png"/>
             <a:graphic>
               <a:graphicData uri="http://schemas.openxmlformats.org/drawingml/2006/picture">
                 <pic:pic>
                   <pic:nvPicPr>
-                    <pic:cNvPr descr="Figure 1. Unadjusted price–area relationships by division." id="0" name="image2.png"/>
+                    <pic:cNvPr descr="Figure 1. Unadjusted price–area relationships by division." id="0" name="image1.png"/>
                     <pic:cNvPicPr preferRelativeResize="0"/>
                   </pic:nvPicPr>
                   <pic:blipFill>
@@ -5254,12 +5254,12 @@
           <wp:inline distB="0" distT="0" distL="114300" distR="114300">
             <wp:extent cx="6492240" cy="5356098"/>
             <wp:effectExtent b="0" l="0" r="0" t="0"/>
-            <wp:docPr descr="Figure 2. Observed–fitted relationship and predictor pairs." id="3" name="image3.png"/>
+            <wp:docPr descr="Figure 2. Observed–fitted relationship and predictor pairs." id="3" name="image4.png"/>
             <a:graphic>
               <a:graphicData uri="http://schemas.openxmlformats.org/drawingml/2006/picture">
                 <pic:pic>
                   <pic:nvPicPr>
-                    <pic:cNvPr descr="Figure 2. Observed–fitted relationship and predictor pairs." id="0" name="image3.png"/>
+                    <pic:cNvPr descr="Figure 2. Observed–fitted relationship and predictor pairs." id="0" name="image4.png"/>
                     <pic:cNvPicPr preferRelativeResize="0"/>
                   </pic:nvPicPr>
                   <pic:blipFill>
@@ -5359,12 +5359,12 @@
           <wp:inline distB="0" distT="0" distL="114300" distR="114300">
             <wp:extent cx="6492240" cy="4284878"/>
             <wp:effectExtent b="0" l="0" r="0" t="0"/>
-            <wp:docPr descr="Figure 3. Residuals, scale-location, Q–Q and numerical predictors." id="2" name="image1.png"/>
+            <wp:docPr descr="Figure 3. Residuals, scale-location, Q–Q and numerical predictors." id="2" name="image2.png"/>
             <a:graphic>
               <a:graphicData uri="http://schemas.openxmlformats.org/drawingml/2006/picture">
                 <pic:pic>
                   <pic:nvPicPr>
-                    <pic:cNvPr descr="Figure 3. Residuals, scale-location, Q–Q and numerical predictors." id="0" name="image1.png"/>
+                    <pic:cNvPr descr="Figure 3. Residuals, scale-location, Q–Q and numerical predictors." id="0" name="image2.png"/>
                     <pic:cNvPicPr preferRelativeResize="0"/>
                   </pic:nvPicPr>
                   <pic:blipFill>
@@ -5465,12 +5465,12 @@
           <wp:inline distB="0" distT="0" distL="114300" distR="114300">
             <wp:extent cx="5697415" cy="7406640"/>
             <wp:effectExtent b="0" l="0" r="0" t="0"/>
-            <wp:docPr descr="Figure 4. Categorical residuals and standardized-residual distribution." id="4" name="image4.png"/>
+            <wp:docPr descr="Figure 4. Categorical residuals and standardized-residual distribution." id="4" name="image3.png"/>
             <a:graphic>
               <a:graphicData uri="http://schemas.openxmlformats.org/drawingml/2006/picture">
                 <pic:pic>
                   <pic:nvPicPr>
-                    <pic:cNvPr descr="Figure 4. Categorical residuals and standardized-residual distribution." id="0" name="image4.png"/>
+                    <pic:cNvPr descr="Figure 4. Categorical residuals and standardized-residual distribution." id="0" name="image3.png"/>
                     <pic:cNvPicPr preferRelativeResize="0"/>
                   </pic:nvPicPr>
                   <pic:blipFill>
@@ -5869,15 +5869,11 @@
             </w:pPr>
             <w:r>
               <w:rPr>
-                <w:b w:val="0"/>
-                <w:bCs w:val="0"/>
-                <w:i w:val="0"/>
-                <w:iCs w:val="0"/>
-                <w:sz w:val="19"/>
-                <w:szCs w:val="19"/>
-                <w:rtl w:val="0"/>
-              </w:rPr>
-              <w:t xml:space="preserve">__________</w:t>
+                <w:sz w:val="19"/>
+                <w:szCs w:val="19"/>
+                <w:rtl w:val="0"/>
+              </w:rPr>
+              <w:t xml:space="preserve">Haiwen Yi</w:t>
             </w:r>
             <w:r>
               <w:rPr>
@@ -5977,15 +5973,11 @@
             </w:pPr>
             <w:r>
               <w:rPr>
-                <w:b w:val="0"/>
-                <w:bCs w:val="0"/>
-                <w:i w:val="0"/>
-                <w:iCs w:val="0"/>
-                <w:sz w:val="19"/>
-                <w:szCs w:val="19"/>
-                <w:rtl w:val="0"/>
-              </w:rPr>
-              <w:t xml:space="preserve">__________</w:t>
+                <w:sz w:val="19"/>
+                <w:szCs w:val="19"/>
+                <w:rtl w:val="0"/>
+              </w:rPr>
+              <w:t xml:space="preserve">Haiwen Yi</w:t>
             </w:r>
             <w:r>
               <w:rPr>
@@ -6085,15 +6077,11 @@
             </w:pPr>
             <w:r>
               <w:rPr>
-                <w:b w:val="0"/>
-                <w:bCs w:val="0"/>
-                <w:i w:val="0"/>
-                <w:iCs w:val="0"/>
-                <w:sz w:val="19"/>
-                <w:szCs w:val="19"/>
-                <w:rtl w:val="0"/>
-              </w:rPr>
-              <w:t xml:space="preserve">__________</w:t>
+                <w:sz w:val="19"/>
+                <w:szCs w:val="19"/>
+                <w:rtl w:val="0"/>
+              </w:rPr>
+              <w:t xml:space="preserve">Haiwen Yi</w:t>
             </w:r>
             <w:r>
               <w:rPr>

</xml_diff>